<commit_message>
Add PRX Intelligence editorial board, APS Council committee, GRC and GPS 2026 talks
</commit_message>
<xml_diff>
--- a/william_ratcliff_cv.docx
+++ b/william_ratcliff_cv.docx
@@ -607,6 +607,30 @@
           <w:b/>
         </w:rPr>
         <w:t xml:space="preserve">Fellow of American Physical Society</w:t>
+      </w:r>
+    </w:p>
+    <w:p>
+      <w:pPr>
+        <w:numPr>
+          <w:ilvl w:val="0"/>
+          <w:numId w:val="1002"/>
+        </w:numPr>
+        <w:pStyle w:val="Compact"/>
+      </w:pPr>
+      <w:r>
+        <w:t xml:space="preserve">Editorial Board, PRX: Intelligence (2026-present)</w:t>
+      </w:r>
+    </w:p>
+    <w:p>
+      <w:pPr>
+        <w:numPr>
+          <w:ilvl w:val="0"/>
+          <w:numId w:val="1002"/>
+        </w:numPr>
+        <w:pStyle w:val="Compact"/>
+      </w:pPr>
+      <w:r>
+        <w:t xml:space="preserve">APS Committee on Council Committees (January 2026-present)</w:t>
       </w:r>
     </w:p>
     <w:p>

</xml_diff>

<commit_message>
Add 2026 pubs (Nguyen, Fruhling arXiv; Baggett RealXRD in-prep); update #101 Zhang and #103 Ratcliff sole to published versions (ACS Nano, Digital Discovery); add invited 2026 talks (Telluride Crystal Communities, MagStr Duke, ACNS, AIMS, MLXN); extend 2026 student roster (Messegee postdoc; Kovvali, Jacobson; extensions for Attention/RealXRD coauthors); update Ed Friedman and Aditya Purohit affiliations
</commit_message>
<xml_diff>
--- a/william_ratcliff_cv.docx
+++ b/william_ratcliff_cv.docx
@@ -1152,19 +1152,85 @@
         <w:pStyle w:val="FirstParagraph"/>
       </w:pPr>
       <w:r>
+        <w:t xml:space="preserve">105.</w:t>
+      </w:r>
+      <w:r>
+        <w:t xml:space="preserve"> </w:t>
+      </w:r>
+      <w:r>
+        <w:t xml:space="preserve">“A high-entropy form of RMn6Sn6 with distinct magnetotransport regimes correlated to different magnetic structures”</w:t>
+      </w:r>
+      <w:r>
+        <w:t xml:space="preserve"> </w:t>
+      </w:r>
+      <w:r>
+        <w:t xml:space="preserve">- Kyle Fruhling, Jonathan Gaudet, William Ratcliff, Jonathan S. White, Siddharth Nandanwar, Noah J. Fau, Gregory T. McCandless, Enrique O. González Delgado, et al. - arXiv:2608.21633, DOI: 10.48550/arXiv.2608.21633 (2026)</w:t>
+      </w:r>
+    </w:p>
+    <w:p>
+      <w:pPr>
+        <w:pStyle w:val="BodyText"/>
+      </w:pPr>
+      <w:r>
+        <w:t xml:space="preserve">104.</w:t>
+      </w:r>
+      <w:r>
+        <w:t xml:space="preserve"> </w:t>
+      </w:r>
+      <w:r>
+        <w:t xml:space="preserve">“Computed materials proposals depart from the structural memory of experimental discovery”</w:t>
+      </w:r>
+      <w:r>
+        <w:t xml:space="preserve"> </w:t>
+      </w:r>
+      <w:r>
+        <w:t xml:space="preserve">- Dan Nguyen, Karen Cao, Brian Chu, Nick Lemoff, Paul Kienzle, William Ratcliff - arXiv:2606.30967, DOI: 10.48550/arXiv.2606.30967 (2026)</w:t>
+      </w:r>
+    </w:p>
+    <w:p>
+      <w:pPr>
+        <w:pStyle w:val="BodyText"/>
+      </w:pPr>
+      <w:r>
         <w:t xml:space="preserve">103.</w:t>
       </w:r>
       <w:r>
         <w:t xml:space="preserve"> </w:t>
       </w:r>
       <w:r>
-        <w:t xml:space="preserve">“Accelerating Quantum Materials Characterization: Hybrid Active Learning for Autonomous Spin Wave Spectroscopy”</w:t>
-      </w:r>
-      <w:r>
-        <w:t xml:space="preserve"> </w:t>
-      </w:r>
-      <w:r>
-        <w:t xml:space="preserve">- William Ratcliff II - arXiv:2604.23821, DOI: 10.48550/arXiv.2604.23821 (2026)</w:t>
+        <w:t xml:space="preserve">“Accelerating quantum materials characterization: hybrid active learning for autonomous spin wave spectroscopy”</w:t>
+      </w:r>
+      <w:r>
+        <w:t xml:space="preserve"> </w:t>
+      </w:r>
+      <w:r>
+        <w:t xml:space="preserve">- William Ratcliff II -</w:t>
+      </w:r>
+      <w:r>
+        <w:t xml:space="preserve"> </w:t>
+      </w:r>
+      <w:r>
+        <w:rPr>
+          <w:i/>
+          <w:iCs/>
+        </w:rPr>
+        <w:t xml:space="preserve">Digital Discovery</w:t>
+      </w:r>
+      <w:r>
+        <w:t xml:space="preserve"> </w:t>
+      </w:r>
+      <w:r>
+        <w:rPr>
+          <w:b/>
+          <w:bCs/>
+        </w:rPr>
+        <w:t xml:space="preserve">5</w:t>
+      </w:r>
+      <w:r>
+        <w:t xml:space="preserve"> </w:t>
+      </w:r>
+      <w:r>
+        <w:t xml:space="preserve">(8), 3256-3274 (2026), DOI: 10.1039/d6dd00232c</w:t>
       </w:r>
     </w:p>
     <w:p>
@@ -1217,7 +1283,7 @@
         <w:t xml:space="preserve"> </w:t>
       </w:r>
       <w:r>
-        <w:t xml:space="preserve">- Qihua Zhang, Christopher Jensen, Alexander Grutter, Sandra Santhosh, William Ratcliff, Julie Borchers, Thomas Heitmann, Narendirakumar Narayanan, Timothy Charlton, Mingyu Yu, Ke Wang, Wesley Auker, Nitin Samarth, Stephanie Law - arXiv:2510.21511 -</w:t>
+        <w:t xml:space="preserve">- Qihua Zhang, Christopher Jensen, Alexander Grutter, Sandra Santhosh, William Ratcliff, Julie Borchers, Thomas Heitmann, Narendirakumar Narayanan, Timothy Charlton, Mingyu Yu, Ke Wang, Wesley Auker, Nitin Samarth, Stephanie Law -</w:t>
       </w:r>
       <w:r>
         <w:t xml:space="preserve"> </w:t>
@@ -1233,7 +1299,17 @@
         <w:t xml:space="preserve"> </w:t>
       </w:r>
       <w:r>
-        <w:t xml:space="preserve">(submitted)</w:t>
+        <w:rPr>
+          <w:b/>
+          <w:bCs/>
+        </w:rPr>
+        <w:t xml:space="preserve">20</w:t>
+      </w:r>
+      <w:r>
+        <w:t xml:space="preserve"> </w:t>
+      </w:r>
+      <w:r>
+        <w:t xml:space="preserve">(31), 21625-21635 (2026), DOI: 10.1021/acsnano.6c01072</w:t>
       </w:r>
     </w:p>
     <w:p>
@@ -5554,6 +5630,81 @@
       </w:pPr>
       <w:r>
         <w:t xml:space="preserve">2026</w:t>
+      </w:r>
+    </w:p>
+    <w:p>
+      <w:pPr>
+        <w:pStyle w:val="Compact"/>
+        <w:numPr>
+          <w:ilvl w:val="0"/>
+          <w:numId w:val="1007"/>
+        </w:numPr>
+      </w:pPr>
+      <w:r>
+        <w:t xml:space="preserve">“Crystal Communities”</w:t>
+      </w:r>
+      <w:r>
+        <w:t xml:space="preserve">, Enhanced Functionalities in 4 and 5d Containing Materials from Large Spin-Orbit Coupling Workshop, Telluride Science Research Center, Telluride, CO (invited)</w:t>
+      </w:r>
+    </w:p>
+    <w:p>
+      <w:pPr>
+        <w:pStyle w:val="Compact"/>
+        <w:numPr>
+          <w:ilvl w:val="0"/>
+          <w:numId w:val="1007"/>
+        </w:numPr>
+      </w:pPr>
+      <w:r>
+        <w:t xml:space="preserve">“Experimental Aspects of Neutron Diffraction”</w:t>
+      </w:r>
+      <w:r>
+        <w:t xml:space="preserve">, Magnetic Structure Determination from Neutron Diffraction Data (MagStr 2026), Duke University, Durham, NC (invited)</w:t>
+      </w:r>
+    </w:p>
+    <w:p>
+      <w:pPr>
+        <w:pStyle w:val="Compact"/>
+        <w:numPr>
+          <w:ilvl w:val="0"/>
+          <w:numId w:val="1007"/>
+        </w:numPr>
+      </w:pPr>
+      <w:r>
+        <w:t xml:space="preserve">“Attention Is Not All You Need for Diffraction”</w:t>
+      </w:r>
+      <w:r>
+        <w:t xml:space="preserve">, 13th American Conference on Neutron Scattering (ACNS 2026), Detroit Marriott at the Renaissance Center, Detroit, MI (invited)</w:t>
+      </w:r>
+    </w:p>
+    <w:p>
+      <w:pPr>
+        <w:pStyle w:val="Compact"/>
+        <w:numPr>
+          <w:ilvl w:val="0"/>
+          <w:numId w:val="1007"/>
+        </w:numPr>
+      </w:pPr>
+      <w:r>
+        <w:t xml:space="preserve">“Attention Is Not All You Need for Diffraction”</w:t>
+      </w:r>
+      <w:r>
+        <w:t xml:space="preserve">, Machine Learning for X-ray and Neutron Science (MLXN) 2026, AGU Conference Center, Washington, DC (invited)</w:t>
+      </w:r>
+    </w:p>
+    <w:p>
+      <w:pPr>
+        <w:pStyle w:val="Compact"/>
+        <w:numPr>
+          <w:ilvl w:val="0"/>
+          <w:numId w:val="1007"/>
+        </w:numPr>
+      </w:pPr>
+      <w:r>
+        <w:t xml:space="preserve">“Attention Is Not All You Need for Diffraction”</w:t>
+      </w:r>
+      <w:r>
+        <w:t xml:space="preserve">, Artificial Intelligence for Materials Science (AIMS) 2026, NIST, Gaithersburg, MD (invited)</w:t>
       </w:r>
     </w:p>
     <w:p>

</xml_diff>